<commit_message>
docs: add HTML organization plan, v3 discovery, version selector, and deployment scripts
- V3_DISCOVERY_REPORT.md: Full analysis of document-organization-system repo (v0.4.9 material properties dashboard)
- HTML_ORGANIZATION_PLAN.md: Strategy for organizing 99 HTML files across v3 and v4 repos
- V3_V4_INTEGRATION_GUIDE.md: Cross-link integration (not submodule) between complementary dashboards
- GITHUB_PAGES_URLS.md: Complete URL map for both GitHub Pages sites
- docs/VERSION_SELECTOR.html: Professional landing page with v4 leak rate + v3 material properties cards
- scripts/deploy_html_structure.sh: Deployment readiness checker with sitemap generation
- docs/sitemap.txt: 69 URLs for GitHub Pages
- docs/.nojekyll: Disable Jekyll processing for GitHub Pages
</commit_message>
<xml_diff>
--- a/MIGRATION_CHECKLIST.docx
+++ b/MIGRATION_CHECKLIST.docx
@@ -2,7 +2,7 @@
 <file path=word/document.xml><?xml version="1.0" encoding="utf-8"?>
 <w:document xmlns:w="http://schemas.openxmlformats.org/wordprocessingml/2006/main" xmlns:m="http://schemas.openxmlformats.org/officeDocument/2006/math" xmlns:r="http://schemas.openxmlformats.org/officeDocument/2006/relationships" xmlns:o="urn:schemas-microsoft-com:office:office" xmlns:v="urn:schemas-microsoft-com:vml" xmlns:w10="urn:schemas-microsoft-com:office:word" xmlns:a="http://schemas.openxmlformats.org/drawingml/2006/main" xmlns:pic="http://schemas.openxmlformats.org/drawingml/2006/picture" xmlns:wp="http://schemas.openxmlformats.org/drawingml/2006/wordprocessingDrawing">
   <w:body>
-    <w:bookmarkStart w:id="51" w:name="multi-repo-migration-checklist"/>
+    <w:bookmarkStart w:id="54" w:name="multi-repo-migration-checklist"/>
     <w:p>
       <w:pPr>
         <w:pStyle w:val="Heading1"/>
@@ -2125,7 +2125,7 @@
     </w:p>
     <w:bookmarkEnd w:id="48"/>
     <w:bookmarkEnd w:id="49"/>
-    <w:bookmarkStart w:id="50" w:name="progress-summary"/>
+    <w:bookmarkStart w:id="53" w:name="progress-summary"/>
     <w:p>
       <w:pPr>
         <w:pStyle w:val="Heading2"/>
@@ -2137,14 +2137,14 @@
     <w:tbl>
       <w:tblPr>
         <w:tblStyle w:val="Table"/>
-        <w:tblW w:type="auto" w:w="0"/>
+        <w:tblW w:type="pct" w:w="5000"/>
         <w:tblLook w:firstRow="1" w:lastRow="0" w:firstColumn="0" w:lastColumn="0" w:noHBand="0" w:noVBand="0" w:val="0020"/>
       </w:tblPr>
       <w:tblGrid>
-        <w:gridCol w:w="1980"/>
-        <w:gridCol w:w="1980"/>
-        <w:gridCol w:w="1980"/>
-        <w:gridCol w:w="1980"/>
+        <w:gridCol w:w="2132"/>
+        <w:gridCol w:w="1827"/>
+        <w:gridCol w:w="2436"/>
+        <w:gridCol w:w="1523"/>
       </w:tblGrid>
       <w:tr>
         <w:trPr>
@@ -2232,7 +2232,23 @@
               <w:jc w:val="left"/>
             </w:pPr>
             <w:r>
-              <w:t xml:space="preserve">🔴 Not started</w:t>
+              <w:t xml:space="preserve">🟡 Committed locally,</w:t>
+            </w:r>
+            <w:r>
+              <w:t xml:space="preserve"> </w:t>
+            </w:r>
+            <w:r>
+              <w:rPr>
+                <w:bCs/>
+                <w:b/>
+              </w:rPr>
+              <w:t xml:space="preserve">no remote</w:t>
+            </w:r>
+            <w:r>
+              <w:t xml:space="preserve"> </w:t>
+            </w:r>
+            <w:r>
+              <w:t xml:space="preserve">(user must create repo)</w:t>
             </w:r>
           </w:p>
         </w:tc>
@@ -2282,7 +2298,7 @@
               <w:jc w:val="left"/>
             </w:pPr>
             <w:r>
-              <w:t xml:space="preserve">🔴 Not started</w:t>
+              <w:t xml:space="preserve">✅ PR created</w:t>
             </w:r>
           </w:p>
         </w:tc>
@@ -2293,9 +2309,14 @@
               <w:pStyle w:val="Compact"/>
               <w:jc w:val="left"/>
             </w:pPr>
-            <w:r>
-              <w:t xml:space="preserve">0/1</w:t>
-            </w:r>
+            <w:hyperlink r:id="rId50">
+              <w:r>
+                <w:rPr>
+                  <w:rStyle w:val="Hyperlink"/>
+                </w:rPr>
+                <w:t xml:space="preserve">PR #14</w:t>
+              </w:r>
+            </w:hyperlink>
           </w:p>
         </w:tc>
       </w:tr>
@@ -2332,7 +2353,7 @@
               <w:jc w:val="left"/>
             </w:pPr>
             <w:r>
-              <w:t xml:space="preserve">🔴 Not started</w:t>
+              <w:t xml:space="preserve">✅ PR created</w:t>
             </w:r>
           </w:p>
         </w:tc>
@@ -2343,9 +2364,14 @@
               <w:pStyle w:val="Compact"/>
               <w:jc w:val="left"/>
             </w:pPr>
-            <w:r>
-              <w:t xml:space="preserve">0/1</w:t>
-            </w:r>
+            <w:hyperlink r:id="rId51">
+              <w:r>
+                <w:rPr>
+                  <w:rStyle w:val="Hyperlink"/>
+                </w:rPr>
+                <w:t xml:space="preserve">PR #400</w:t>
+              </w:r>
+            </w:hyperlink>
           </w:p>
         </w:tc>
       </w:tr>
@@ -2531,7 +2557,7 @@
         <w:t xml:space="preserve"> </w:t>
       </w:r>
       <w:r>
-        <w:t xml:space="preserve">0</w:t>
+        <w:t xml:space="preserve">2</w:t>
       </w:r>
       <w:r>
         <w:t xml:space="preserve"> </w:t>
@@ -2547,11 +2573,87 @@
         <w:t xml:space="preserve"> </w:t>
       </w:r>
       <w:r>
-        <w:t xml:space="preserve">0</w:t>
-      </w:r>
-    </w:p>
-    <w:bookmarkEnd w:id="50"/>
-    <w:bookmarkEnd w:id="51"/>
+        <w:t xml:space="preserve">0 (awaiting user review)</w:t>
+      </w:r>
+    </w:p>
+    <w:bookmarkStart w:id="52" w:name="created-prs"/>
+    <w:p>
+      <w:pPr>
+        <w:pStyle w:val="Heading3"/>
+      </w:pPr>
+      <w:r>
+        <w:t xml:space="preserve">Created PRs</w:t>
+      </w:r>
+    </w:p>
+    <w:p>
+      <w:pPr>
+        <w:numPr>
+          <w:ilvl w:val="0"/>
+          <w:numId w:val="1025"/>
+        </w:numPr>
+        <w:pStyle w:val="Compact"/>
+      </w:pPr>
+      <w:r>
+        <w:rPr>
+          <w:bCs/>
+          <w:b/>
+        </w:rPr>
+        <w:t xml:space="preserve">DOCX_RTM_Automation</w:t>
+      </w:r>
+      <w:r>
+        <w:t xml:space="preserve"> </w:t>
+      </w:r>
+      <w:hyperlink r:id="rId50">
+        <w:r>
+          <w:rPr>
+            <w:rStyle w:val="Hyperlink"/>
+          </w:rPr>
+          <w:t xml:space="preserve">PR #14</w:t>
+        </w:r>
+      </w:hyperlink>
+      <w:r>
+        <w:t xml:space="preserve"> </w:t>
+      </w:r>
+      <w:r>
+        <w:t xml:space="preserve">— Contract specs, addenda, SoR matrix</w:t>
+      </w:r>
+    </w:p>
+    <w:p>
+      <w:pPr>
+        <w:numPr>
+          <w:ilvl w:val="0"/>
+          <w:numId w:val="1025"/>
+        </w:numPr>
+        <w:pStyle w:val="Compact"/>
+      </w:pPr>
+      <w:r>
+        <w:rPr>
+          <w:bCs/>
+          <w:b/>
+        </w:rPr>
+        <w:t xml:space="preserve">ABACUS</w:t>
+      </w:r>
+      <w:r>
+        <w:t xml:space="preserve"> </w:t>
+      </w:r>
+      <w:hyperlink r:id="rId51">
+        <w:r>
+          <w:rPr>
+            <w:rStyle w:val="Hyperlink"/>
+          </w:rPr>
+          <w:t xml:space="preserve">PR #400</w:t>
+        </w:r>
+      </w:hyperlink>
+      <w:r>
+        <w:t xml:space="preserve"> </w:t>
+      </w:r>
+      <w:r>
+        <w:t xml:space="preserve">— Warm compressor comparison (ALaT vs LKT)</w:t>
+      </w:r>
+    </w:p>
+    <w:bookmarkEnd w:id="52"/>
+    <w:bookmarkEnd w:id="53"/>
+    <w:bookmarkEnd w:id="54"/>
     <w:sectPr/>
   </w:body>
 </w:document>
@@ -2728,6 +2830,91 @@
     <w:lvl w:ilvl="8">
       <w:numFmt w:val="bullet"/>
       <w:lvlText w:val="•"/>
+      <w:lvlJc w:val="left"/>
+      <w:pPr>
+        <w:ind w:left="6480" w:hanging="480"/>
+      </w:pPr>
+    </w:lvl>
+  </w:abstractNum>
+  <w:abstractNum w:abstractNumId="99411">
+    <w:nsid w:val="A99411"/>
+    <w:multiLevelType w:val="multilevel"/>
+    <w:lvl w:ilvl="0">
+      <w:start w:val="1"/>
+      <w:numFmt w:val="decimal"/>
+      <w:lvlText w:val="%1."/>
+      <w:lvlJc w:val="left"/>
+      <w:pPr>
+        <w:ind w:left="720" w:hanging="480"/>
+      </w:pPr>
+    </w:lvl>
+    <w:lvl w:ilvl="1">
+      <w:start w:val="1"/>
+      <w:numFmt w:val="decimal"/>
+      <w:lvlText w:val="%2."/>
+      <w:lvlJc w:val="left"/>
+      <w:pPr>
+        <w:ind w:left="1440" w:hanging="480"/>
+      </w:pPr>
+    </w:lvl>
+    <w:lvl w:ilvl="2">
+      <w:start w:val="1"/>
+      <w:numFmt w:val="decimal"/>
+      <w:lvlText w:val="%3."/>
+      <w:lvlJc w:val="left"/>
+      <w:pPr>
+        <w:ind w:left="2160" w:hanging="480"/>
+      </w:pPr>
+    </w:lvl>
+    <w:lvl w:ilvl="3">
+      <w:start w:val="1"/>
+      <w:numFmt w:val="decimal"/>
+      <w:lvlText w:val="%4."/>
+      <w:lvlJc w:val="left"/>
+      <w:pPr>
+        <w:ind w:left="2880" w:hanging="480"/>
+      </w:pPr>
+    </w:lvl>
+    <w:lvl w:ilvl="4">
+      <w:start w:val="1"/>
+      <w:numFmt w:val="decimal"/>
+      <w:lvlText w:val="%5."/>
+      <w:lvlJc w:val="left"/>
+      <w:pPr>
+        <w:ind w:left="3600" w:hanging="480"/>
+      </w:pPr>
+    </w:lvl>
+    <w:lvl w:ilvl="5">
+      <w:start w:val="1"/>
+      <w:numFmt w:val="decimal"/>
+      <w:lvlText w:val="%6."/>
+      <w:lvlJc w:val="left"/>
+      <w:pPr>
+        <w:ind w:left="4320" w:hanging="480"/>
+      </w:pPr>
+    </w:lvl>
+    <w:lvl w:ilvl="6">
+      <w:start w:val="1"/>
+      <w:numFmt w:val="decimal"/>
+      <w:lvlText w:val="%7."/>
+      <w:lvlJc w:val="left"/>
+      <w:pPr>
+        <w:ind w:left="5040" w:hanging="480"/>
+      </w:pPr>
+    </w:lvl>
+    <w:lvl w:ilvl="7">
+      <w:start w:val="1"/>
+      <w:numFmt w:val="decimal"/>
+      <w:lvlText w:val="%8."/>
+      <w:lvlJc w:val="left"/>
+      <w:pPr>
+        <w:ind w:left="5760" w:hanging="480"/>
+      </w:pPr>
+    </w:lvl>
+    <w:lvl w:ilvl="8">
+      <w:start w:val="1"/>
+      <w:numFmt w:val="decimal"/>
+      <w:lvlText w:val="%9."/>
       <w:lvlJc w:val="left"/>
       <w:pPr>
         <w:ind w:left="6480" w:hanging="480"/>
@@ -2808,6 +2995,36 @@
   </w:num>
   <w:num w:numId="1024">
     <w:abstractNumId w:val="991"/>
+  </w:num>
+  <w:num w:numId="1025">
+    <w:abstractNumId w:val="99411"/>
+    <w:lvlOverride w:ilvl="0">
+      <w:startOverride w:val="1"/>
+    </w:lvlOverride>
+    <w:lvlOverride w:ilvl="1">
+      <w:startOverride w:val="1"/>
+    </w:lvlOverride>
+    <w:lvlOverride w:ilvl="2">
+      <w:startOverride w:val="1"/>
+    </w:lvlOverride>
+    <w:lvlOverride w:ilvl="3">
+      <w:startOverride w:val="1"/>
+    </w:lvlOverride>
+    <w:lvlOverride w:ilvl="4">
+      <w:startOverride w:val="1"/>
+    </w:lvlOverride>
+    <w:lvlOverride w:ilvl="5">
+      <w:startOverride w:val="1"/>
+    </w:lvlOverride>
+    <w:lvlOverride w:ilvl="6">
+      <w:startOverride w:val="1"/>
+    </w:lvlOverride>
+    <w:lvlOverride w:ilvl="7">
+      <w:startOverride w:val="1"/>
+    </w:lvlOverride>
+    <w:lvlOverride w:ilvl="8">
+      <w:startOverride w:val="1"/>
+    </w:lvlOverride>
   </w:num>
 </w:numbering>
 </file>

</xml_diff>